<commit_message>
Finalize Amazon resume with real CFC operations details
- Replace placeholder metrics with actual fulfilment-centre work (multi-order
  trolley runs, ~85 items/run, ambient/chilled/frozen zones, accuracy method,
  Direct-to-Boot/P2P, dispatch & inventory teams, out-of-stock resolution,
  training new starters, rush picks)
- Rebuild Word (.docx) resume
- Update application checklist

Co-Authored-By: Claude Opus 4.8 <noreply@anthropic.com>
Claude-Session: https://claude.ai/code/session_01Vp78qzuZBam51uunUEeLam
</commit_message>
<xml_diff>
--- a/applications/amazon-graduate-area-manager/Chirag_Singh_Resume.docx
+++ b/applications/amazon-graduate-area-manager/Chirag_Singh_Resume.docx
@@ -202,7 +202,7 @@
         <w:rPr>
           <w:sz w:val="20"/>
         </w:rPr>
-        <w:t>Pick, pack and fulfil [add #] customer orders per shift in a high-volume distribution environment, consistently meeting accuracy and on-time-completion targets under time pressure.</w:t>
+        <w:t>Pick and pack multi-order trolley runs (up to 9 customer orders, ~85 items per run) across ambient, chilled and frozen zones, consistently completing runs ahead of target times.</w:t>
       </w:r>
     </w:p>
     <w:p>
@@ -215,7 +215,7 @@
         <w:rPr>
           <w:sz w:val="20"/>
         </w:rPr>
-        <w:t>Maintain quality and safety standards on the floor; collaborate with team members to remove bottlenecks and lift throughput.</w:t>
+        <w:t>Maintain high pick accuracy by verifying item images and article numbers, minimising mispicks in a fast-paced, time-sensitive environment.</w:t>
       </w:r>
     </w:p>
     <w:p>
@@ -228,7 +228,33 @@
         <w:rPr>
           <w:sz w:val="20"/>
         </w:rPr>
-        <w:t>[add a process-improvement example: a suggestion/change you made and its result].</w:t>
+        <w:t>Fulfil Direct-to-Boot (P2P) orders end-to-end and support dispatch handovers when required; have also worked alongside the night dispatch and inventory teams.</w:t>
+      </w:r>
+    </w:p>
+    <w:p>
+      <w:pPr>
+        <w:pStyle w:val="ListBullet"/>
+        <w:spacing w:before="0" w:after="20"/>
+        <w:ind w:left="360"/>
+      </w:pPr>
+      <w:r>
+        <w:rPr>
+          <w:sz w:val="20"/>
+        </w:rPr>
+        <w:t>Resolve out-of-stock and missed orders by locating alternatives and completing short-picked items, protecting order completeness and customer satisfaction.</w:t>
+      </w:r>
+    </w:p>
+    <w:p>
+      <w:pPr>
+        <w:pStyle w:val="ListBullet"/>
+        <w:spacing w:before="0" w:after="20"/>
+        <w:ind w:left="360"/>
+      </w:pPr>
+      <w:r>
+        <w:rPr>
+          <w:sz w:val="20"/>
+        </w:rPr>
+        <w:t>Train new starters and take on "rush picks" to help colleagues finish their runs once own targets are met — keeping the team on schedule.</w:t>
       </w:r>
     </w:p>
     <w:p>

</xml_diff>

<commit_message>
Add work-rights (485 visa) note to Amazon resume and cover letter
Co-Authored-By: Claude Opus 4.8 <noreply@anthropic.com>
Claude-Session: https://claude.ai/code/session_01Vp78qzuZBam51uunUEeLam
</commit_message>
<xml_diff>
--- a/applications/amazon-graduate-area-manager/Chirag_Singh_Resume.docx
+++ b/applications/amazon-graduate-area-manager/Chirag_Singh_Resume.docx
@@ -68,6 +68,24 @@
           <w:sz w:val="21"/>
         </w:rPr>
         <w:t>MBA candidate with hands-on fulfilment-centre and warehouse operations experience, combining frontline execution in high-volume logistics with applied business strategy, data analytics, and supply-chain consulting. Comfortable working to targets under time pressure, maintaining safety and quality standards, and using data to improve processes. Eager to step into a people-leadership role and develop a high-performing team. Available for night-shift operations.</w:t>
+      </w:r>
+    </w:p>
+    <w:p>
+      <w:pPr>
+        <w:spacing w:before="40" w:after="40"/>
+      </w:pPr>
+      <w:r>
+        <w:rPr>
+          <w:b/>
+          <w:sz w:val="20"/>
+        </w:rPr>
+        <w:t xml:space="preserve">Work rights: </w:t>
+      </w:r>
+      <w:r>
+        <w:rPr>
+          <w:sz w:val="20"/>
+        </w:rPr>
+        <w:t>Completing MBA (results July 2026); eligible to apply for the Temporary Graduate visa (subclass 485) with full, unrestricted work rights from August 2026.</w:t>
       </w:r>
     </w:p>
     <w:p>

</xml_diff>